<commit_message>
feat: implement automatic status updates and email notifications for document generation with optional admin confirmation
</commit_message>
<xml_diff>
--- a/HRCP-KKU-Academic/uploads/academic/2/doc_0.docx
+++ b/HRCP-KKU-Academic/uploads/academic/2/doc_0.docx
@@ -24,22 +24,21 @@
           <w:color w:val="000000" w:themeColor="text1"/>
           <w:sz w:val="56"/>
           <w:szCs w:val="56"/>
-          <w:bdr w:val="none" w:sz="0" w:space="0" w:color="auto" w:frame="1"/>
           <w:lang w:val="en-US"/>
         </w:rPr>
         <w:drawing>
-          <wp:anchor distT="0" distB="0" distL="114300" distR="114300" simplePos="0" relativeHeight="251658240" behindDoc="1" locked="0" layoutInCell="1" allowOverlap="1" wp14:anchorId="22B4C2D6" wp14:editId="3512CC73">
+          <wp:anchor distT="0" distB="0" distL="114300" distR="114300" simplePos="0" relativeHeight="251659264" behindDoc="0" locked="1" layoutInCell="1" allowOverlap="1" wp14:anchorId="68A6F703" wp14:editId="7992DAA0">
             <wp:simplePos x="0" y="0"/>
             <wp:positionH relativeFrom="margin">
-              <wp:align>left</wp:align>
+              <wp:posOffset>0</wp:posOffset>
             </wp:positionH>
             <wp:positionV relativeFrom="paragraph">
-              <wp:posOffset>-485775</wp:posOffset>
+              <wp:posOffset>-327660</wp:posOffset>
             </wp:positionV>
-            <wp:extent cx="468000" cy="764082"/>
-            <wp:effectExtent l="0" t="0" r="8255" b="0"/>
+            <wp:extent cx="457282" cy="748800"/>
+            <wp:effectExtent l="0" t="0" r="0" b="635"/>
             <wp:wrapNone/>
-            <wp:docPr id="2" name="Picture 2" descr="https://lh3.googleusercontent.com/RUGxSPAwTS4yvIpoPVCk8wMCSE6vWtoCU_mCL5tGlpb3_d2QI-5TYLPoKo3S3ZdGM0Opl29NbcWPmKR4fHvqOoEokHbXGUGlwY238swDT41QDsXoOkf3VwFKCEt9w9leEPgLeNE"/>
+            <wp:docPr id="2" name="Picture 2"/>
             <wp:cNvGraphicFramePr>
               <a:graphicFrameLocks xmlns:a="http://schemas.openxmlformats.org/drawingml/2006/main" noChangeAspect="1"/>
             </wp:cNvGraphicFramePr>
@@ -47,7 +46,7 @@
               <a:graphicData uri="http://schemas.openxmlformats.org/drawingml/2006/picture">
                 <pic:pic xmlns:pic="http://schemas.openxmlformats.org/drawingml/2006/picture">
                   <pic:nvPicPr>
-                    <pic:cNvPr id="0" name="Picture 1" descr="https://lh3.googleusercontent.com/RUGxSPAwTS4yvIpoPVCk8wMCSE6vWtoCU_mCL5tGlpb3_d2QI-5TYLPoKo3S3ZdGM0Opl29NbcWPmKR4fHvqOoEokHbXGUGlwY238swDT41QDsXoOkf3VwFKCEt9w9leEPgLeNE"/>
+                    <pic:cNvPr id="0" name="Picture 1"/>
                     <pic:cNvPicPr>
                       <a:picLocks noChangeAspect="1" noChangeArrowheads="1"/>
                     </pic:cNvPicPr>
@@ -68,7 +67,7 @@
                   <pic:spPr bwMode="auto">
                     <a:xfrm>
                       <a:off x="0" y="0"/>
-                      <a:ext cx="468000" cy="764082"/>
+                      <a:ext cx="457282" cy="748800"/>
                     </a:xfrm>
                     <a:prstGeom prst="rect">
                       <a:avLst/>
@@ -313,7 +312,6 @@
         </w:rPr>
         <w:t/>
       </w:r>
-      <w:proofErr w:type="spellStart"/>
       <w:r>
         <w:rPr>
           <w:rFonts w:ascii="TH Sarabun New" w:eastAsia="Times New Roman" w:hAnsi="TH Sarabun New" w:cs="TH Sarabun New"/>
@@ -324,7 +322,6 @@
         </w:rPr>
         <w:t/>
       </w:r>
-      <w:proofErr w:type="spellEnd"/>
       <w:r>
         <w:rPr>
           <w:rFonts w:ascii="TH Sarabun New" w:eastAsia="Times New Roman" w:hAnsi="TH Sarabun New" w:cs="TH Sarabun New"/>
@@ -381,20 +378,33 @@
       </w:r>
       <w:r>
         <w:rPr>
-          <w:rFonts w:ascii="TH Sarabun New" w:eastAsia="Times New Roman" w:hAnsi="TH Sarabun New" w:cs="TH Sarabun New"/>
-          <w:color w:val="000000" w:themeColor="text1"/>
-          <w:sz w:val="32"/>
-          <w:szCs w:val="32"/>
-          <w:lang w:eastAsia="en-GB"/>
-        </w:rPr>
-        <w:t>7 มีนาคม 2569</w:t>
+          <w:rFonts w:ascii="TH Sarabun New" w:eastAsia="Times New Roman" w:hAnsi="TH Sarabun New" w:cs="TH Sarabun New" w:hint="cs"/>
+          <w:b/>
+          <w:bCs/>
+          <w:color w:val="000000" w:themeColor="text1"/>
+          <w:sz w:val="32"/>
+          <w:szCs w:val="32"/>
+          <w:cs/>
+          <w:lang w:eastAsia="en-GB"/>
+        </w:rPr>
+        <w:t xml:space="preserve"> </w:t>
+      </w:r>
+      <w:r>
+        <w:rPr>
+          <w:rFonts w:ascii="TH Sarabun New" w:eastAsia="Times New Roman" w:hAnsi="TH Sarabun New" w:cs="TH Sarabun New"/>
+          <w:color w:val="000000" w:themeColor="text1"/>
+          <w:sz w:val="32"/>
+          <w:szCs w:val="32"/>
+          <w:lang w:eastAsia="en-GB"/>
+        </w:rPr>
+        <w:t>11 สิงหาคม 2569</w:t>
       </w:r>
     </w:p>
     <w:p>
       <w:pPr>
         <w:ind w:left="283" w:right="283"/>
         <w:rPr>
-          <w:rFonts w:ascii="TH Sarabun New" w:eastAsia="Times New Roman" w:hAnsi="TH Sarabun New" w:cs="TH Sarabun New" w:hint="cs"/>
+          <w:rFonts w:ascii="TH Sarabun New" w:eastAsia="Times New Roman" w:hAnsi="TH Sarabun New" w:cs="TH Sarabun New"/>
           <w:color w:val="000000" w:themeColor="text1"/>
           <w:sz w:val="16"/>
           <w:szCs w:val="16"/>
@@ -576,6 +586,57 @@
           <w:szCs w:val="32"/>
           <w:lang w:eastAsia="en-GB"/>
         </w:rPr>
+        <w:t xml:space="preserve"> ผู้ช่วยศาสตราจารย์ทดสอบ ผู้ใช้งาน</w:t>
+      </w:r>
+      <w:r>
+        <w:rPr>
+          <w:rFonts w:ascii="TH Sarabun New" w:eastAsia="Times New Roman" w:hAnsi="TH Sarabun New" w:cs="TH Sarabun New"/>
+          <w:color w:val="000000" w:themeColor="text1"/>
+          <w:sz w:val="32"/>
+          <w:szCs w:val="32"/>
+          <w:lang w:val="en-US" w:eastAsia="en-GB"/>
+        </w:rPr>
+        <w:t/>
+      </w:r>
+      <w:r>
+        <w:rPr>
+          <w:rFonts w:ascii="TH Sarabun New" w:eastAsia="Times New Roman" w:hAnsi="TH Sarabun New" w:cs="TH Sarabun New"/>
+          <w:color w:val="000000" w:themeColor="text1"/>
+          <w:sz w:val="32"/>
+          <w:szCs w:val="32"/>
+          <w:lang w:eastAsia="en-GB"/>
+        </w:rPr>
+        <w:t/>
+      </w:r>
+      <w:r>
+        <w:rPr>
+          <w:rFonts w:ascii="TH Sarabun New" w:eastAsia="Times New Roman" w:hAnsi="TH Sarabun New" w:cs="TH Sarabun New"/>
+          <w:color w:val="000000" w:themeColor="text1"/>
+          <w:sz w:val="32"/>
+          <w:szCs w:val="32"/>
+          <w:lang w:eastAsia="en-GB"/>
+        </w:rPr>
+        <w:t/>
+      </w:r>
+      <w:r>
+        <w:rPr>
+          <w:rFonts w:ascii="TH Sarabun New" w:eastAsia="Times New Roman" w:hAnsi="TH Sarabun New" w:cs="TH Sarabun New"/>
+          <w:color w:val="000000" w:themeColor="text1"/>
+          <w:sz w:val="32"/>
+          <w:szCs w:val="32"/>
+          <w:lang w:eastAsia="en-GB"/>
+        </w:rPr>
+        <w:t/>
+      </w:r>
+      <w:r>
+        <w:rPr>
+          <w:rFonts w:ascii="TH Sarabun New" w:eastAsia="Times New Roman" w:hAnsi="TH Sarabun New" w:cs="TH Sarabun New" w:hint="cs"/>
+          <w:color w:val="000000" w:themeColor="text1"/>
+          <w:sz w:val="32"/>
+          <w:szCs w:val="32"/>
+          <w:cs/>
+          <w:lang w:eastAsia="en-GB"/>
+        </w:rPr>
         <w:t xml:space="preserve"> </w:t>
       </w:r>
       <w:r>
@@ -586,15 +647,15 @@
           <w:szCs w:val="32"/>
           <w:lang w:eastAsia="en-GB"/>
         </w:rPr>
-        <w:t>Apec</w:t>
-      </w:r>
-      <w:r>
-        <w:rPr>
-          <w:rFonts w:ascii="TH Sarabun New" w:eastAsia="Times New Roman" w:hAnsi="TH Sarabun New" w:cs="TH Sarabun New"/>
-          <w:color w:val="000000" w:themeColor="text1"/>
-          <w:sz w:val="32"/>
-          <w:szCs w:val="32"/>
-          <w:lang w:val="en-US" w:eastAsia="en-GB"/>
+        <w:t>ข้าราชการ</w:t>
+      </w:r>
+      <w:r>
+        <w:rPr>
+          <w:rFonts w:ascii="TH Sarabun New" w:eastAsia="Times New Roman" w:hAnsi="TH Sarabun New" w:cs="TH Sarabun New"/>
+          <w:color w:val="000000" w:themeColor="text1"/>
+          <w:sz w:val="32"/>
+          <w:szCs w:val="32"/>
+          <w:lang w:eastAsia="en-GB"/>
         </w:rPr>
         <w:t/>
       </w:r>
@@ -608,7 +669,37 @@
         </w:rPr>
         <w:t/>
       </w:r>
-      <w:proofErr w:type="spellStart"/>
+      <w:r>
+        <w:rPr>
+          <w:rFonts w:ascii="TH Sarabun New" w:eastAsia="Times New Roman" w:hAnsi="TH Sarabun New" w:cs="TH Sarabun New" w:hint="cs"/>
+          <w:color w:val="000000" w:themeColor="text1"/>
+          <w:sz w:val="32"/>
+          <w:szCs w:val="32"/>
+          <w:lang w:eastAsia="en-GB"/>
+        </w:rPr>
+        <w:t xml:space="preserve"> </w:t>
+      </w:r>
+      <w:r>
+        <w:rPr>
+          <w:rFonts w:ascii="TH Sarabun New" w:eastAsia="Times New Roman" w:hAnsi="TH Sarabun New" w:cs="TH Sarabun New" w:hint="cs"/>
+          <w:color w:val="000000" w:themeColor="text1"/>
+          <w:sz w:val="32"/>
+          <w:szCs w:val="32"/>
+          <w:cs/>
+          <w:lang w:eastAsia="en-GB"/>
+        </w:rPr>
+        <w:t xml:space="preserve">ประเภท วิชาการ ตำแหน่ง </w:t>
+      </w:r>
+      <w:r>
+        <w:rPr>
+          <w:rFonts w:ascii="TH Sarabun New" w:eastAsia="Times New Roman" w:hAnsi="TH Sarabun New" w:cs="TH Sarabun New"/>
+          <w:color w:val="000000" w:themeColor="text1"/>
+          <w:sz w:val="32"/>
+          <w:szCs w:val="32"/>
+          <w:lang w:eastAsia="en-GB"/>
+        </w:rPr>
+        <w:t>อาจารย์</w:t>
+      </w:r>
       <w:r>
         <w:rPr>
           <w:rFonts w:ascii="TH Sarabun New" w:eastAsia="Times New Roman" w:hAnsi="TH Sarabun New" w:cs="TH Sarabun New"/>
@@ -619,7 +710,6 @@
         </w:rPr>
         <w:t/>
       </w:r>
-      <w:proofErr w:type="spellEnd"/>
       <w:r>
         <w:rPr>
           <w:rFonts w:ascii="TH Sarabun New" w:eastAsia="Times New Roman" w:hAnsi="TH Sarabun New" w:cs="TH Sarabun New"/>
@@ -639,67 +729,66 @@
           <w:cs/>
           <w:lang w:eastAsia="en-GB"/>
         </w:rPr>
+        <w:t xml:space="preserve"> ปฏิบัติงานที่ สาขาวิชาวิทยาการคอมพิวเตอร์ สังกัด วิทยาลัยการคอมพิวเตอร์ มีความประสงค์ขอรับการประเมินการสอนจากคณะอนุกรรมการประเมินผลการสอน เพื่อประกอบการขอกำหนดตำแหน่งทางวิชาการระดับ</w:t>
+      </w:r>
+      <w:r>
+        <w:rPr>
+          <w:rFonts w:ascii="TH Sarabun New" w:eastAsia="Times New Roman" w:hAnsi="TH Sarabun New" w:cs="TH Sarabun New"/>
+          <w:color w:val="000000" w:themeColor="text1"/>
+          <w:sz w:val="32"/>
+          <w:szCs w:val="32"/>
+          <w:lang w:eastAsia="en-GB"/>
+        </w:rPr>
+        <w:t xml:space="preserve"> [</w:t>
+      </w:r>
+      <w:r>
+        <w:rPr>
+          <w:rFonts w:ascii="TH Sarabun New" w:eastAsia="Times New Roman" w:hAnsi="TH Sarabun New" w:cs="TH Sarabun New"/>
+          <w:color w:val="000000" w:themeColor="text1"/>
+          <w:sz w:val="32"/>
+          <w:szCs w:val="32"/>
+          <w:lang w:val="en-US" w:eastAsia="en-GB"/>
+        </w:rPr>
+        <w:t>✓]</w:t>
+      </w:r>
+      <w:r>
+        <w:rPr>
+          <w:rFonts w:ascii="TH Sarabun New" w:eastAsia="Times New Roman" w:hAnsi="TH Sarabun New" w:cs="TH Sarabun New"/>
+          <w:color w:val="000000" w:themeColor="text1"/>
+          <w:sz w:val="32"/>
+          <w:szCs w:val="32"/>
+          <w:lang w:val="en-US" w:eastAsia="en-GB"/>
+        </w:rPr>
         <w:t xml:space="preserve"> </w:t>
       </w:r>
       <w:r>
         <w:rPr>
-          <w:rFonts w:ascii="TH Sarabun New" w:eastAsia="Times New Roman" w:hAnsi="TH Sarabun New" w:cs="TH Sarabun New"/>
-          <w:color w:val="000000" w:themeColor="text1"/>
-          <w:sz w:val="32"/>
-          <w:szCs w:val="32"/>
-          <w:lang w:eastAsia="en-GB"/>
-        </w:rPr>
-        <w:t>{{employee_type}}</w:t>
-      </w:r>
-      <w:proofErr w:type="spellStart"/>
-      <w:r>
-        <w:rPr>
-          <w:rFonts w:ascii="TH Sarabun New" w:eastAsia="Times New Roman" w:hAnsi="TH Sarabun New" w:cs="TH Sarabun New"/>
-          <w:color w:val="000000" w:themeColor="text1"/>
-          <w:sz w:val="32"/>
-          <w:szCs w:val="32"/>
-          <w:lang w:eastAsia="en-GB"/>
-        </w:rPr>
-        <w:t/>
-      </w:r>
-      <w:r>
-        <w:rPr>
-          <w:rFonts w:ascii="TH Sarabun New" w:eastAsia="Times New Roman" w:hAnsi="TH Sarabun New" w:cs="TH Sarabun New"/>
-          <w:color w:val="000000" w:themeColor="text1"/>
-          <w:sz w:val="32"/>
-          <w:szCs w:val="32"/>
-          <w:lang w:eastAsia="en-GB"/>
-        </w:rPr>
-        <w:t/>
-      </w:r>
-      <w:r>
-        <w:rPr>
-          <w:rFonts w:ascii="TH Sarabun New" w:eastAsia="Times New Roman" w:hAnsi="TH Sarabun New" w:cs="TH Sarabun New"/>
-          <w:color w:val="000000" w:themeColor="text1"/>
-          <w:sz w:val="32"/>
-          <w:szCs w:val="32"/>
-          <w:lang w:eastAsia="en-GB"/>
-        </w:rPr>
-        <w:t/>
-      </w:r>
-      <w:proofErr w:type="spellEnd"/>
-      <w:r>
-        <w:rPr>
-          <w:rFonts w:ascii="TH Sarabun New" w:eastAsia="Times New Roman" w:hAnsi="TH Sarabun New" w:cs="TH Sarabun New"/>
-          <w:color w:val="000000" w:themeColor="text1"/>
-          <w:sz w:val="32"/>
-          <w:szCs w:val="32"/>
-          <w:lang w:eastAsia="en-GB"/>
-        </w:rPr>
-        <w:t/>
-      </w:r>
-      <w:r>
-        <w:rPr>
           <w:rFonts w:ascii="TH Sarabun New" w:eastAsia="Times New Roman" w:hAnsi="TH Sarabun New" w:cs="TH Sarabun New" w:hint="cs"/>
           <w:color w:val="000000" w:themeColor="text1"/>
           <w:sz w:val="32"/>
           <w:szCs w:val="32"/>
-          <w:lang w:eastAsia="en-GB"/>
+          <w:cs/>
+          <w:lang w:val="en-US" w:eastAsia="en-GB"/>
+        </w:rPr>
+        <w:t xml:space="preserve">ผู้ช่วยศาสตราจารย์ </w:t>
+      </w:r>
+      <w:r>
+        <w:rPr>
+          <w:rFonts w:ascii="TH Sarabun New" w:eastAsia="Times New Roman" w:hAnsi="TH Sarabun New" w:cs="TH Sarabun New"/>
+          <w:color w:val="000000" w:themeColor="text1"/>
+          <w:sz w:val="32"/>
+          <w:szCs w:val="32"/>
+          <w:lang w:val="en-US" w:eastAsia="en-GB"/>
+        </w:rPr>
+        <w:t>[]</w:t>
+      </w:r>
+      <w:r>
+        <w:rPr>
+          <w:rFonts w:ascii="TH Sarabun New" w:eastAsia="Times New Roman" w:hAnsi="TH Sarabun New" w:cs="TH Sarabun New"/>
+          <w:color w:val="000000" w:themeColor="text1"/>
+          <w:sz w:val="32"/>
+          <w:szCs w:val="32"/>
+          <w:lang w:val="en-US" w:eastAsia="en-GB"/>
         </w:rPr>
         <w:t xml:space="preserve"> </w:t>
       </w:r>
@@ -710,9 +799,29 @@
           <w:sz w:val="32"/>
           <w:szCs w:val="32"/>
           <w:cs/>
-          <w:lang w:eastAsia="en-GB"/>
-        </w:rPr>
-        <w:t>ประเภท</w:t>
+          <w:lang w:val="en-US" w:eastAsia="en-GB"/>
+        </w:rPr>
+        <w:t xml:space="preserve">รองศาสตราจารย์ </w:t>
+      </w:r>
+      <w:r>
+        <w:rPr>
+          <w:rFonts w:ascii="TH Sarabun New" w:eastAsia="Times New Roman" w:hAnsi="TH Sarabun New" w:cs="TH Sarabun New"/>
+          <w:color w:val="000000" w:themeColor="text1"/>
+          <w:sz w:val="32"/>
+          <w:szCs w:val="32"/>
+          <w:lang w:val="en-US" w:eastAsia="en-GB"/>
+        </w:rPr>
+        <w:t>[]</w:t>
+      </w:r>
+      <w:r>
+        <w:rPr>
+          <w:rFonts w:ascii="TH Sarabun New" w:eastAsia="Times New Roman" w:hAnsi="TH Sarabun New" w:cs="TH Sarabun New"/>
+          <w:color w:val="000000" w:themeColor="text1"/>
+          <w:sz w:val="32"/>
+          <w:szCs w:val="32"/>
+          <w:lang w:val="en-US" w:eastAsia="en-GB"/>
+        </w:rPr>
+        <w:t xml:space="preserve"> </w:t>
       </w:r>
       <w:r>
         <w:rPr>
@@ -721,269 +830,9 @@
           <w:sz w:val="32"/>
           <w:szCs w:val="32"/>
           <w:cs/>
-          <w:lang w:eastAsia="en-GB"/>
-        </w:rPr>
-        <w:t xml:space="preserve"> </w:t>
-      </w:r>
-      <w:r>
-        <w:rPr>
-          <w:rFonts w:ascii="TH Sarabun New" w:eastAsia="Times New Roman" w:hAnsi="TH Sarabun New" w:cs="TH Sarabun New" w:hint="cs"/>
-          <w:color w:val="000000" w:themeColor="text1"/>
-          <w:sz w:val="32"/>
-          <w:szCs w:val="32"/>
-          <w:cs/>
-          <w:lang w:eastAsia="en-GB"/>
-        </w:rPr>
-        <w:t xml:space="preserve">วิชาการ ตำแหน่ง </w:t>
-      </w:r>
-      <w:r>
-        <w:rPr>
-          <w:rFonts w:ascii="TH Sarabun New" w:eastAsia="Times New Roman" w:hAnsi="TH Sarabun New" w:cs="TH Sarabun New"/>
-          <w:color w:val="000000" w:themeColor="text1"/>
-          <w:sz w:val="32"/>
-          <w:szCs w:val="32"/>
-          <w:lang w:eastAsia="en-GB"/>
-        </w:rPr>
-        <w:t/>
-      </w:r>
-      <w:proofErr w:type="spellStart"/>
-      <w:r>
-        <w:rPr>
-          <w:rFonts w:ascii="TH Sarabun New" w:eastAsia="Times New Roman" w:hAnsi="TH Sarabun New" w:cs="TH Sarabun New"/>
-          <w:color w:val="000000" w:themeColor="text1"/>
-          <w:sz w:val="32"/>
-          <w:szCs w:val="32"/>
-          <w:lang w:eastAsia="en-GB"/>
-        </w:rPr>
-        <w:t/>
-      </w:r>
-      <w:r>
-        <w:rPr>
-          <w:rFonts w:ascii="TH Sarabun New" w:eastAsia="Times New Roman" w:hAnsi="TH Sarabun New" w:cs="TH Sarabun New"/>
-          <w:color w:val="000000" w:themeColor="text1"/>
-          <w:sz w:val="32"/>
-          <w:szCs w:val="32"/>
-          <w:lang w:eastAsia="en-GB"/>
-        </w:rPr>
-        <w:t/>
-      </w:r>
-      <w:proofErr w:type="spellEnd"/>
-      <w:r>
-        <w:rPr>
-          <w:rFonts w:ascii="TH Sarabun New" w:eastAsia="Times New Roman" w:hAnsi="TH Sarabun New" w:cs="TH Sarabun New"/>
-          <w:color w:val="000000" w:themeColor="text1"/>
-          <w:sz w:val="32"/>
-          <w:szCs w:val="32"/>
-          <w:lang w:eastAsia="en-GB"/>
-        </w:rPr>
-        <w:t/>
-      </w:r>
-      <w:r>
-        <w:rPr>
-          <w:rFonts w:ascii="TH Sarabun New" w:eastAsia="Times New Roman" w:hAnsi="TH Sarabun New" w:cs="TH Sarabun New" w:hint="cs"/>
-          <w:color w:val="000000" w:themeColor="text1"/>
-          <w:sz w:val="32"/>
-          <w:szCs w:val="32"/>
-          <w:cs/>
-          <w:lang w:eastAsia="en-GB"/>
-        </w:rPr>
-        <w:t xml:space="preserve"> ปฏิบัติงานที่ สาขาวิชาวิทยาการคอมพิวเตอร์ สังกัด วิทยาลัยการคอมพิวเตอร์ มีความประสงค์ขอรับการประเมินการสอนจากคณะอนุกรรมการประเมินผลการสอน เพื่อประกอบการขอกำหนดตำแหน่งทางวิชาการระดับ </w:t>
-      </w:r>
-      <w:r>
-        <w:rPr>
-          <w:rFonts w:ascii="TH Sarabun New" w:eastAsia="Times New Roman" w:hAnsi="TH Sarabun New" w:cs="TH Sarabun New"/>
-          <w:color w:val="000000" w:themeColor="text1"/>
-          <w:sz w:val="32"/>
-          <w:szCs w:val="32"/>
-          <w:lang w:val="en-US" w:eastAsia="en-GB"/>
-        </w:rPr>
-        <w:t>[</w:t>
-      </w:r>
-      <w:r>
-        <w:rPr>
-          <w:rFonts w:ascii="TH Sarabun New" w:eastAsia="Times New Roman" w:hAnsi="TH Sarabun New" w:cs="TH Sarabun New"/>
-          <w:color w:val="000000" w:themeColor="text1"/>
-          <w:sz w:val="32"/>
-          <w:szCs w:val="32"/>
-          <w:lang w:val="en-US" w:eastAsia="en-GB"/>
-        </w:rPr>
-        <w:t>{{chk1}}</w:t>
-      </w:r>
-      <w:r>
-        <w:rPr>
-          <w:rFonts w:ascii="TH Sarabun New" w:eastAsia="Times New Roman" w:hAnsi="TH Sarabun New" w:cs="TH Sarabun New"/>
-          <w:color w:val="000000" w:themeColor="text1"/>
-          <w:sz w:val="32"/>
-          <w:szCs w:val="32"/>
-          <w:lang w:val="en-US" w:eastAsia="en-GB"/>
-        </w:rPr>
-        <w:t xml:space="preserve">] </w:t>
-      </w:r>
-      <w:r>
-        <w:rPr>
-          <w:rFonts w:ascii="TH Sarabun New" w:eastAsia="Times New Roman" w:hAnsi="TH Sarabun New" w:cs="TH Sarabun New" w:hint="cs"/>
-          <w:color w:val="000000" w:themeColor="text1"/>
-          <w:sz w:val="32"/>
-          <w:szCs w:val="32"/>
-          <w:cs/>
-          <w:lang w:val="en-US" w:eastAsia="en-GB"/>
-        </w:rPr>
-        <w:t xml:space="preserve">ผู้ช่วยศาสตราจารย์  </w:t>
-      </w:r>
-      <w:r>
-        <w:rPr>
-          <w:rFonts w:ascii="TH Sarabun New" w:eastAsia="Times New Roman" w:hAnsi="TH Sarabun New" w:cs="TH Sarabun New"/>
-          <w:color w:val="000000" w:themeColor="text1"/>
-          <w:sz w:val="32"/>
-          <w:szCs w:val="32"/>
-          <w:lang w:val="en-US" w:eastAsia="en-GB"/>
-        </w:rPr>
-        <w:t>[</w:t>
-      </w:r>
-      <w:r>
-        <w:rPr>
-          <w:rFonts w:ascii="TH Sarabun New" w:eastAsia="Times New Roman" w:hAnsi="TH Sarabun New" w:cs="TH Sarabun New"/>
-          <w:color w:val="000000" w:themeColor="text1"/>
-          <w:sz w:val="32"/>
-          <w:szCs w:val="32"/>
-          <w:lang w:val="en-US" w:eastAsia="en-GB"/>
-        </w:rPr>
-        <w:t>{{chk2}}</w:t>
-      </w:r>
-      <w:r>
-        <w:rPr>
-          <w:rFonts w:ascii="TH Sarabun New" w:eastAsia="Times New Roman" w:hAnsi="TH Sarabun New" w:cs="TH Sarabun New"/>
-          <w:color w:val="000000" w:themeColor="text1"/>
-          <w:sz w:val="32"/>
-          <w:szCs w:val="32"/>
-          <w:lang w:val="en-US" w:eastAsia="en-GB"/>
-        </w:rPr>
-        <w:t/>
-      </w:r>
-      <w:r>
-        <w:rPr>
-          <w:rFonts w:ascii="TH Sarabun New" w:eastAsia="Times New Roman" w:hAnsi="TH Sarabun New" w:cs="TH Sarabun New"/>
-          <w:color w:val="000000" w:themeColor="text1"/>
-          <w:sz w:val="32"/>
-          <w:szCs w:val="32"/>
-          <w:lang w:val="en-US" w:eastAsia="en-GB"/>
-        </w:rPr>
-        <w:t/>
-      </w:r>
-      <w:r>
-        <w:rPr>
-          <w:rFonts w:ascii="TH Sarabun New" w:eastAsia="Times New Roman" w:hAnsi="TH Sarabun New" w:cs="TH Sarabun New"/>
-          <w:color w:val="000000" w:themeColor="text1"/>
-          <w:sz w:val="32"/>
-          <w:szCs w:val="32"/>
-          <w:lang w:val="en-US" w:eastAsia="en-GB"/>
-        </w:rPr>
-        <w:t xml:space="preserve">] </w:t>
-      </w:r>
-      <w:r>
-        <w:rPr>
-          <w:rFonts w:ascii="TH Sarabun New" w:eastAsia="Times New Roman" w:hAnsi="TH Sarabun New" w:cs="TH Sarabun New" w:hint="cs"/>
-          <w:color w:val="000000" w:themeColor="text1"/>
-          <w:sz w:val="32"/>
-          <w:szCs w:val="32"/>
-          <w:cs/>
-          <w:lang w:val="en-US" w:eastAsia="en-GB"/>
-        </w:rPr>
-        <w:t xml:space="preserve">รองศาสตราจารย์ </w:t>
-      </w:r>
-      <w:r>
-        <w:rPr>
-          <w:rFonts w:ascii="TH Sarabun New" w:eastAsia="Times New Roman" w:hAnsi="TH Sarabun New" w:cs="TH Sarabun New"/>
-          <w:color w:val="000000" w:themeColor="text1"/>
-          <w:sz w:val="32"/>
-          <w:szCs w:val="32"/>
-          <w:lang w:val="en-US" w:eastAsia="en-GB"/>
-        </w:rPr>
-        <w:t>[</w:t>
-      </w:r>
-      <w:r>
-        <w:rPr>
-          <w:rFonts w:ascii="TH Sarabun New" w:eastAsia="Times New Roman" w:hAnsi="TH Sarabun New" w:cs="TH Sarabun New"/>
-          <w:color w:val="000000" w:themeColor="text1"/>
-          <w:sz w:val="32"/>
-          <w:szCs w:val="32"/>
-          <w:lang w:val="en-US" w:eastAsia="en-GB"/>
-        </w:rPr>
-        <w:t>{{chk3}}</w:t>
-      </w:r>
-      <w:r>
-        <w:rPr>
-          <w:rFonts w:ascii="TH Sarabun New" w:eastAsia="Times New Roman" w:hAnsi="TH Sarabun New" w:cs="TH Sarabun New"/>
-          <w:color w:val="000000" w:themeColor="text1"/>
-          <w:sz w:val="32"/>
-          <w:szCs w:val="32"/>
-          <w:lang w:val="en-US" w:eastAsia="en-GB"/>
-        </w:rPr>
-        <w:t/>
-      </w:r>
-      <w:r>
-        <w:rPr>
-          <w:rFonts w:ascii="TH Sarabun New" w:eastAsia="Times New Roman" w:hAnsi="TH Sarabun New" w:cs="TH Sarabun New"/>
-          <w:color w:val="000000" w:themeColor="text1"/>
-          <w:sz w:val="32"/>
-          <w:szCs w:val="32"/>
-          <w:lang w:val="en-US" w:eastAsia="en-GB"/>
-        </w:rPr>
-        <w:t/>
-      </w:r>
-      <w:r>
-        <w:rPr>
-          <w:rFonts w:ascii="TH Sarabun New" w:eastAsia="Times New Roman" w:hAnsi="TH Sarabun New" w:cs="TH Sarabun New"/>
-          <w:color w:val="000000" w:themeColor="text1"/>
-          <w:sz w:val="32"/>
-          <w:szCs w:val="32"/>
-          <w:lang w:val="en-US" w:eastAsia="en-GB"/>
-        </w:rPr>
-        <w:t xml:space="preserve">] </w:t>
-      </w:r>
-      <w:r>
-        <w:rPr>
-          <w:rFonts w:ascii="TH Sarabun New" w:eastAsia="Times New Roman" w:hAnsi="TH Sarabun New" w:cs="TH Sarabun New" w:hint="cs"/>
-          <w:color w:val="000000" w:themeColor="text1"/>
-          <w:sz w:val="32"/>
-          <w:szCs w:val="32"/>
-          <w:cs/>
-          <w:lang w:val="en-US" w:eastAsia="en-GB"/>
-        </w:rPr>
-        <w:t xml:space="preserve">ศาสตราจารย์ </w:t>
-      </w:r>
-      <w:r>
-        <w:rPr>
-          <w:rFonts w:ascii="TH Sarabun New" w:eastAsia="Times New Roman" w:hAnsi="TH Sarabun New" w:cs="TH Sarabun New" w:hint="cs"/>
-          <w:color w:val="000000" w:themeColor="text1"/>
-          <w:sz w:val="32"/>
-          <w:szCs w:val="32"/>
-          <w:cs/>
-          <w:lang w:val="en-US" w:eastAsia="en-GB"/>
-        </w:rPr>
-        <w:t xml:space="preserve">พร้อมนี้ได้แนบเอกสารประกอบการขอประเมินผลการสอน จำนวน </w:t>
-      </w:r>
-      <w:r>
-        <w:rPr>
-          <w:rFonts w:ascii="TH Sarabun New" w:eastAsia="Times New Roman" w:hAnsi="TH Sarabun New" w:cs="TH Sarabun New" w:hint="cs"/>
-          <w:color w:val="000000" w:themeColor="text1"/>
-          <w:sz w:val="32"/>
-          <w:szCs w:val="32"/>
-          <w:cs/>
-          <w:lang w:val="en-US" w:eastAsia="en-GB"/>
-        </w:rPr>
-        <w:t xml:space="preserve">      </w:t>
-      </w:r>
-      <w:r>
-        <w:rPr>
-          <w:rFonts w:ascii="TH Sarabun New" w:eastAsia="Times New Roman" w:hAnsi="TH Sarabun New" w:cs="TH Sarabun New" w:hint="cs"/>
-          <w:color w:val="000000" w:themeColor="text1"/>
-          <w:sz w:val="32"/>
-          <w:szCs w:val="32"/>
-          <w:cs/>
-          <w:lang w:val="en-US" w:eastAsia="en-GB"/>
-        </w:rPr>
-        <w:t>3 ชุด ดังนี้</w:t>
+          <w:lang w:val="en-US" w:eastAsia="en-GB"/>
+        </w:rPr>
+        <w:t>ศาสตราจารย์ พร้อมนี้ได้แนบเอกสารประกอบการขอประเมินผลการสอน จำนวน  3 ชุด ดังนี้</w:t>
       </w:r>
     </w:p>
     <w:p>
@@ -1020,6 +869,139 @@
         </w:rPr>
         <w:t>1. แผนการสอน พร้อมเกณฑ์และวิธีวัดประเมินผลของผู้เรียน</w:t>
       </w:r>
+      <w:r>
+        <w:rPr>
+          <w:rFonts w:ascii="TH Sarabun New" w:eastAsia="Times New Roman" w:hAnsi="TH Sarabun New" w:cs="TH Sarabun New"/>
+          <w:color w:val="000000" w:themeColor="text1"/>
+          <w:sz w:val="32"/>
+          <w:szCs w:val="32"/>
+          <w:lang w:val="en-US" w:eastAsia="en-GB"/>
+        </w:rPr>
+        <w:t xml:space="preserve"> </w:t>
+      </w:r>
+      <w:r>
+        <w:rPr>
+          <w:rFonts w:ascii="TH Sarabun New" w:eastAsia="Times New Roman" w:hAnsi="TH Sarabun New" w:cs="TH Sarabun New" w:hint="cs"/>
+          <w:color w:val="000000" w:themeColor="text1"/>
+          <w:sz w:val="32"/>
+          <w:szCs w:val="32"/>
+          <w:cs/>
+          <w:lang w:val="en-US" w:eastAsia="en-GB"/>
+        </w:rPr>
+        <w:t>รายวิชา</w:t>
+      </w:r>
+      <w:r>
+        <w:rPr>
+          <w:rFonts w:ascii="TH Sarabun New" w:eastAsia="Times New Roman" w:hAnsi="TH Sarabun New" w:cs="TH Sarabun New"/>
+          <w:color w:val="000000" w:themeColor="text1"/>
+          <w:sz w:val="32"/>
+          <w:szCs w:val="32"/>
+          <w:lang w:val="en-US" w:eastAsia="en-GB"/>
+        </w:rPr>
+        <w:t xml:space="preserve"> 4567890 </w:t>
+      </w:r>
+      <w:r>
+        <w:rPr>
+          <w:rFonts w:ascii="TH Sarabun New" w:hAnsi="TH Sarabun New" w:cs="TH Sarabun New"/>
+          <w:color w:val="000000" w:themeColor="text1"/>
+          <w:sz w:val="32"/>
+          <w:szCs w:val="32"/>
+          <w:shd w:val="clear" w:color="auto" w:fill="FFFFFF"/>
+        </w:rPr>
+        <w:t/>
+      </w:r>
+      <w:r>
+        <w:rPr>
+          <w:rFonts w:ascii="TH Sarabun New" w:eastAsia="Times New Roman" w:hAnsi="TH Sarabun New" w:cs="TH Sarabun New"/>
+          <w:color w:val="000000" w:themeColor="text1"/>
+          <w:sz w:val="32"/>
+          <w:szCs w:val="32"/>
+          <w:lang w:val="en-US" w:eastAsia="en-GB"/>
+        </w:rPr>
+        <w:t xml:space="preserve"/>
+      </w:r>
+      <w:r>
+        <w:rPr>
+          <w:rFonts w:ascii="TH Sarabun New" w:eastAsia="Times New Roman" w:hAnsi="TH Sarabun New" w:cs="TH Sarabun New" w:hint="cs"/>
+          <w:color w:val="000000" w:themeColor="text1"/>
+          <w:sz w:val="32"/>
+          <w:szCs w:val="32"/>
+          <w:cs/>
+          <w:lang w:val="en-US" w:eastAsia="en-GB"/>
+        </w:rPr>
+        <w:t>รหัสวิชา</w:t>
+      </w:r>
+      <w:r>
+        <w:rPr>
+          <w:rFonts w:ascii="TH Sarabun New" w:eastAsia="Times New Roman" w:hAnsi="TH Sarabun New" w:cs="TH Sarabun New"/>
+          <w:color w:val="000000" w:themeColor="text1"/>
+          <w:sz w:val="32"/>
+          <w:szCs w:val="32"/>
+          <w:lang w:val="en-US" w:eastAsia="en-GB"/>
+        </w:rPr>
+        <w:t xml:space="preserve"> CP123</w:t>
+      </w:r>
+      <w:r>
+        <w:rPr>
+          <w:rFonts w:ascii="TH Sarabun New" w:hAnsi="TH Sarabun New" w:cs="TH Sarabun New"/>
+          <w:color w:val="000000" w:themeColor="text1"/>
+          <w:sz w:val="32"/>
+          <w:szCs w:val="32"/>
+          <w:shd w:val="clear" w:color="auto" w:fill="FFFFFF"/>
+        </w:rPr>
+        <w:t/>
+      </w:r>
+      <w:r>
+        <w:rPr>
+          <w:rFonts w:ascii="TH Sarabun New" w:eastAsia="Times New Roman" w:hAnsi="TH Sarabun New" w:cs="TH Sarabun New"/>
+          <w:color w:val="000000" w:themeColor="text1"/>
+          <w:sz w:val="32"/>
+          <w:szCs w:val="32"/>
+          <w:lang w:val="en-US" w:eastAsia="en-GB"/>
+        </w:rPr>
+        <w:t/>
+      </w:r>
+      <w:r>
+        <w:rPr>
+          <w:rFonts w:ascii="TH Sarabun New" w:eastAsia="Times New Roman" w:hAnsi="TH Sarabun New" w:cs="TH Sarabun New" w:hint="cs"/>
+          <w:color w:val="000000" w:themeColor="text1"/>
+          <w:sz w:val="32"/>
+          <w:szCs w:val="32"/>
+          <w:cs/>
+          <w:lang w:val="en-US" w:eastAsia="en-GB"/>
+        </w:rPr>
+        <w:t xml:space="preserve"> ปีการศึกษา</w:t>
+      </w:r>
+      <w:r>
+        <w:rPr>
+          <w:rFonts w:ascii="TH Sarabun New" w:eastAsia="Times New Roman" w:hAnsi="TH Sarabun New" w:cs="TH Sarabun New"/>
+          <w:color w:val="000000" w:themeColor="text1"/>
+          <w:sz w:val="32"/>
+          <w:szCs w:val="32"/>
+          <w:lang w:val="en-US" w:eastAsia="en-GB"/>
+        </w:rPr>
+        <w:t xml:space="preserve"> 2569</w:t>
+      </w:r>
+      <w:r>
+        <w:rPr>
+          <w:rFonts w:ascii="TH Sarabun New" w:eastAsia="Times New Roman" w:hAnsi="TH Sarabun New" w:cs="TH Sarabun New"/>
+          <w:color w:val="000000" w:themeColor="text1"/>
+          <w:sz w:val="32"/>
+          <w:szCs w:val="32"/>
+          <w:lang w:eastAsia="en-GB"/>
+        </w:rPr>
+        <w:t/>
+      </w:r>
+      <w:r>
+        <w:rPr>
+          <w:rFonts w:ascii="TH Sarabun New" w:eastAsia="Times New Roman" w:hAnsi="TH Sarabun New" w:cs="TH Sarabun New"/>
+          <w:color w:val="000000" w:themeColor="text1"/>
+          <w:sz w:val="32"/>
+          <w:szCs w:val="32"/>
+          <w:lang w:val="en-US" w:eastAsia="en-GB"/>
+        </w:rPr>
+        <w:t/>
+      </w:r>
     </w:p>
     <w:p>
       <w:pPr>
@@ -1055,6 +1037,139 @@
         </w:rPr>
         <w:t>2. สาระสำคัญของเนื้อหาวิชาประกอบการบรรยายหรือการจัดกิจกรรมการเรียนรู้</w:t>
       </w:r>
+      <w:r>
+        <w:rPr>
+          <w:rFonts w:ascii="TH Sarabun New" w:eastAsia="Times New Roman" w:hAnsi="TH Sarabun New" w:cs="TH Sarabun New"/>
+          <w:color w:val="000000" w:themeColor="text1"/>
+          <w:sz w:val="32"/>
+          <w:szCs w:val="32"/>
+          <w:lang w:val="en-US" w:eastAsia="en-GB"/>
+        </w:rPr>
+        <w:t xml:space="preserve"> </w:t>
+      </w:r>
+      <w:r>
+        <w:rPr>
+          <w:rFonts w:ascii="TH Sarabun New" w:eastAsia="Times New Roman" w:hAnsi="TH Sarabun New" w:cs="TH Sarabun New" w:hint="cs"/>
+          <w:color w:val="000000" w:themeColor="text1"/>
+          <w:sz w:val="32"/>
+          <w:szCs w:val="32"/>
+          <w:cs/>
+          <w:lang w:val="en-US" w:eastAsia="en-GB"/>
+        </w:rPr>
+        <w:t>รายวิชา</w:t>
+      </w:r>
+      <w:r>
+        <w:rPr>
+          <w:rFonts w:ascii="TH Sarabun New" w:eastAsia="Times New Roman" w:hAnsi="TH Sarabun New" w:cs="TH Sarabun New"/>
+          <w:color w:val="000000" w:themeColor="text1"/>
+          <w:sz w:val="32"/>
+          <w:szCs w:val="32"/>
+          <w:lang w:val="en-US" w:eastAsia="en-GB"/>
+        </w:rPr>
+        <w:t xml:space="preserve"> 4567890</w:t>
+      </w:r>
+      <w:r>
+        <w:rPr>
+          <w:rFonts w:ascii="TH Sarabun New" w:hAnsi="TH Sarabun New" w:cs="TH Sarabun New"/>
+          <w:color w:val="000000" w:themeColor="text1"/>
+          <w:sz w:val="32"/>
+          <w:szCs w:val="32"/>
+          <w:shd w:val="clear" w:color="auto" w:fill="FFFFFF"/>
+        </w:rPr>
+        <w:t/>
+      </w:r>
+      <w:r>
+        <w:rPr>
+          <w:rFonts w:ascii="TH Sarabun New" w:eastAsia="Times New Roman" w:hAnsi="TH Sarabun New" w:cs="TH Sarabun New"/>
+          <w:color w:val="000000" w:themeColor="text1"/>
+          <w:sz w:val="32"/>
+          <w:szCs w:val="32"/>
+          <w:lang w:val="en-US" w:eastAsia="en-GB"/>
+        </w:rPr>
+        <w:t/>
+      </w:r>
+      <w:r>
+        <w:rPr>
+          <w:rFonts w:ascii="TH Sarabun New" w:eastAsia="Times New Roman" w:hAnsi="TH Sarabun New" w:cs="TH Sarabun New" w:hint="cs"/>
+          <w:color w:val="000000" w:themeColor="text1"/>
+          <w:sz w:val="32"/>
+          <w:szCs w:val="32"/>
+          <w:cs/>
+          <w:lang w:val="en-US" w:eastAsia="en-GB"/>
+        </w:rPr>
+        <w:t xml:space="preserve"> รหัสวิชา </w:t>
+      </w:r>
+      <w:r>
+        <w:rPr>
+          <w:rFonts w:ascii="TH Sarabun New" w:eastAsia="Times New Roman" w:hAnsi="TH Sarabun New" w:cs="TH Sarabun New"/>
+          <w:color w:val="000000" w:themeColor="text1"/>
+          <w:sz w:val="32"/>
+          <w:szCs w:val="32"/>
+          <w:lang w:val="en-US" w:eastAsia="en-GB"/>
+        </w:rPr>
+        <w:t>CP123 </w:t>
+      </w:r>
+      <w:r>
+        <w:rPr>
+          <w:rFonts w:ascii="TH Sarabun New" w:hAnsi="TH Sarabun New" w:cs="TH Sarabun New"/>
+          <w:color w:val="000000" w:themeColor="text1"/>
+          <w:sz w:val="32"/>
+          <w:szCs w:val="32"/>
+          <w:shd w:val="clear" w:color="auto" w:fill="FFFFFF"/>
+        </w:rPr>
+        <w:t/>
+      </w:r>
+      <w:r>
+        <w:rPr>
+          <w:rFonts w:ascii="TH Sarabun New" w:eastAsia="Times New Roman" w:hAnsi="TH Sarabun New" w:cs="TH Sarabun New"/>
+          <w:color w:val="000000" w:themeColor="text1"/>
+          <w:sz w:val="32"/>
+          <w:szCs w:val="32"/>
+          <w:lang w:val="en-US" w:eastAsia="en-GB"/>
+        </w:rPr>
+        <w:t xml:space="preserve"/>
+      </w:r>
+      <w:r>
+        <w:rPr>
+          <w:rFonts w:ascii="TH Sarabun New" w:eastAsia="Times New Roman" w:hAnsi="TH Sarabun New" w:cs="TH Sarabun New" w:hint="cs"/>
+          <w:color w:val="000000" w:themeColor="text1"/>
+          <w:sz w:val="32"/>
+          <w:szCs w:val="32"/>
+          <w:cs/>
+          <w:lang w:val="en-US" w:eastAsia="en-GB"/>
+        </w:rPr>
+        <w:t>ปีการศึกษา</w:t>
+      </w:r>
+      <w:r>
+        <w:rPr>
+          <w:rFonts w:ascii="TH Sarabun New" w:eastAsia="Times New Roman" w:hAnsi="TH Sarabun New" w:cs="TH Sarabun New"/>
+          <w:color w:val="000000" w:themeColor="text1"/>
+          <w:sz w:val="32"/>
+          <w:szCs w:val="32"/>
+          <w:lang w:val="en-US" w:eastAsia="en-GB"/>
+        </w:rPr>
+        <w:t xml:space="preserve"> 2569</w:t>
+      </w:r>
+      <w:r>
+        <w:rPr>
+          <w:rFonts w:ascii="TH Sarabun New" w:eastAsia="Times New Roman" w:hAnsi="TH Sarabun New" w:cs="TH Sarabun New"/>
+          <w:color w:val="000000" w:themeColor="text1"/>
+          <w:sz w:val="32"/>
+          <w:szCs w:val="32"/>
+          <w:lang w:eastAsia="en-GB"/>
+        </w:rPr>
+        <w:t/>
+      </w:r>
+      <w:r>
+        <w:rPr>
+          <w:rFonts w:ascii="TH Sarabun New" w:eastAsia="Times New Roman" w:hAnsi="TH Sarabun New" w:cs="TH Sarabun New"/>
+          <w:color w:val="000000" w:themeColor="text1"/>
+          <w:sz w:val="32"/>
+          <w:szCs w:val="32"/>
+          <w:lang w:val="en-US" w:eastAsia="en-GB"/>
+        </w:rPr>
+        <w:t/>
+      </w:r>
     </w:p>
     <w:p>
       <w:pPr>
@@ -1109,7 +1224,17 @@
           <w:cs/>
           <w:lang w:val="en-US" w:eastAsia="en-GB"/>
         </w:rPr>
-        <w:t>สื่อปฏิสัมพันธ์</w:t>
+        <w:t>สื่อปฏิสัมพันธ์แบบดิจิทัลและอื่นๆ</w:t>
+      </w:r>
+      <w:r>
+        <w:rPr>
+          <w:rFonts w:ascii="TH Sarabun New" w:eastAsia="Times New Roman" w:hAnsi="TH Sarabun New" w:cs="TH Sarabun New"/>
+          <w:color w:val="000000" w:themeColor="text1"/>
+          <w:sz w:val="32"/>
+          <w:szCs w:val="32"/>
+          <w:lang w:val="en-US" w:eastAsia="en-GB"/>
+        </w:rPr>
+        <w:t xml:space="preserve"> </w:t>
       </w:r>
       <w:r>
         <w:rPr>
@@ -1120,7 +1245,119 @@
           <w:cs/>
           <w:lang w:val="en-US" w:eastAsia="en-GB"/>
         </w:rPr>
-        <w:t>แบบดิจิทัลและอื่นๆ</w:t>
+        <w:t>รายวิชา</w:t>
+      </w:r>
+      <w:r>
+        <w:rPr>
+          <w:rFonts w:ascii="TH Sarabun New" w:eastAsia="Times New Roman" w:hAnsi="TH Sarabun New" w:cs="TH Sarabun New"/>
+          <w:color w:val="000000" w:themeColor="text1"/>
+          <w:sz w:val="32"/>
+          <w:szCs w:val="32"/>
+          <w:lang w:val="en-US" w:eastAsia="en-GB"/>
+        </w:rPr>
+        <w:t xml:space="preserve"> 4567890 </w:t>
+      </w:r>
+      <w:r>
+        <w:rPr>
+          <w:rFonts w:ascii="TH Sarabun New" w:hAnsi="TH Sarabun New" w:cs="TH Sarabun New"/>
+          <w:color w:val="000000" w:themeColor="text1"/>
+          <w:sz w:val="32"/>
+          <w:szCs w:val="32"/>
+          <w:shd w:val="clear" w:color="auto" w:fill="FFFFFF"/>
+        </w:rPr>
+        <w:t/>
+      </w:r>
+      <w:r>
+        <w:rPr>
+          <w:rFonts w:ascii="TH Sarabun New" w:eastAsia="Times New Roman" w:hAnsi="TH Sarabun New" w:cs="TH Sarabun New"/>
+          <w:color w:val="000000" w:themeColor="text1"/>
+          <w:sz w:val="32"/>
+          <w:szCs w:val="32"/>
+          <w:lang w:val="en-US" w:eastAsia="en-GB"/>
+        </w:rPr>
+        <w:t xml:space="preserve"/>
+      </w:r>
+      <w:r>
+        <w:rPr>
+          <w:rFonts w:ascii="TH Sarabun New" w:eastAsia="Times New Roman" w:hAnsi="TH Sarabun New" w:cs="TH Sarabun New" w:hint="cs"/>
+          <w:color w:val="000000" w:themeColor="text1"/>
+          <w:sz w:val="32"/>
+          <w:szCs w:val="32"/>
+          <w:cs/>
+          <w:lang w:val="en-US" w:eastAsia="en-GB"/>
+        </w:rPr>
+        <w:t>รหัสวิชา</w:t>
+      </w:r>
+      <w:r>
+        <w:rPr>
+          <w:rFonts w:ascii="TH Sarabun New" w:eastAsia="Times New Roman" w:hAnsi="TH Sarabun New" w:cs="TH Sarabun New"/>
+          <w:color w:val="000000" w:themeColor="text1"/>
+          <w:sz w:val="32"/>
+          <w:szCs w:val="32"/>
+          <w:lang w:val="en-US" w:eastAsia="en-GB"/>
+        </w:rPr>
+        <w:t xml:space="preserve"> CP123 </w:t>
+      </w:r>
+      <w:r>
+        <w:rPr>
+          <w:rFonts w:ascii="TH Sarabun New" w:hAnsi="TH Sarabun New" w:cs="TH Sarabun New"/>
+          <w:color w:val="000000" w:themeColor="text1"/>
+          <w:sz w:val="32"/>
+          <w:szCs w:val="32"/>
+          <w:shd w:val="clear" w:color="auto" w:fill="FFFFFF"/>
+        </w:rPr>
+        <w:t/>
+      </w:r>
+      <w:r>
+        <w:rPr>
+          <w:rFonts w:ascii="TH Sarabun New" w:eastAsia="Times New Roman" w:hAnsi="TH Sarabun New" w:cs="TH Sarabun New"/>
+          <w:color w:val="000000" w:themeColor="text1"/>
+          <w:sz w:val="32"/>
+          <w:szCs w:val="32"/>
+          <w:lang w:val="en-US" w:eastAsia="en-GB"/>
+        </w:rPr>
+        <w:t xml:space="preserve"/>
+      </w:r>
+      <w:r>
+        <w:rPr>
+          <w:rFonts w:ascii="TH Sarabun New" w:eastAsia="Times New Roman" w:hAnsi="TH Sarabun New" w:cs="TH Sarabun New" w:hint="cs"/>
+          <w:color w:val="000000" w:themeColor="text1"/>
+          <w:sz w:val="32"/>
+          <w:szCs w:val="32"/>
+          <w:cs/>
+          <w:lang w:val="en-US" w:eastAsia="en-GB"/>
+        </w:rPr>
+        <w:t>ปีการศึกษา</w:t>
+      </w:r>
+      <w:r>
+        <w:rPr>
+          <w:rFonts w:ascii="TH Sarabun New" w:eastAsia="Times New Roman" w:hAnsi="TH Sarabun New" w:cs="TH Sarabun New"/>
+          <w:color w:val="000000" w:themeColor="text1"/>
+          <w:sz w:val="32"/>
+          <w:szCs w:val="32"/>
+          <w:lang w:val="en-US" w:eastAsia="en-GB"/>
+        </w:rPr>
+        <w:t xml:space="preserve"> 2569</w:t>
+      </w:r>
+      <w:r>
+        <w:rPr>
+          <w:rFonts w:ascii="TH Sarabun New" w:eastAsia="Times New Roman" w:hAnsi="TH Sarabun New" w:cs="TH Sarabun New"/>
+          <w:color w:val="000000" w:themeColor="text1"/>
+          <w:sz w:val="32"/>
+          <w:szCs w:val="32"/>
+          <w:lang w:eastAsia="en-GB"/>
+        </w:rPr>
+        <w:t/>
+      </w:r>
+      <w:r>
+        <w:rPr>
+          <w:rFonts w:ascii="TH Sarabun New" w:eastAsia="Times New Roman" w:hAnsi="TH Sarabun New" w:cs="TH Sarabun New"/>
+          <w:color w:val="000000" w:themeColor="text1"/>
+          <w:sz w:val="32"/>
+          <w:szCs w:val="32"/>
+          <w:lang w:val="en-US" w:eastAsia="en-GB"/>
+        </w:rPr>
+        <w:t/>
       </w:r>
     </w:p>
     <w:p>
@@ -1304,41 +1541,28 @@
           <w:cs/>
           <w:lang w:eastAsia="en-GB"/>
         </w:rPr>
-        <w:t xml:space="preserve">      </w:t>
-      </w:r>
-      <w:r>
-        <w:rPr>
-          <w:rFonts w:ascii="TH Sarabun New" w:eastAsia="Times New Roman" w:hAnsi="TH Sarabun New" w:cs="TH Sarabun New" w:hint="cs"/>
-          <w:color w:val="000000" w:themeColor="text1"/>
-          <w:sz w:val="32"/>
-          <w:szCs w:val="32"/>
-          <w:cs/>
-          <w:lang w:eastAsia="en-GB"/>
-        </w:rPr>
-        <w:t>(</w:t>
-      </w:r>
-      <w:r>
-        <w:rPr>
-          <w:rFonts w:ascii="TH Sarabun New" w:eastAsia="Times New Roman" w:hAnsi="TH Sarabun New" w:cs="TH Sarabun New"/>
-          <w:color w:val="000000" w:themeColor="text1"/>
-          <w:sz w:val="32"/>
-          <w:szCs w:val="32"/>
-          <w:lang w:eastAsia="en-GB"/>
-        </w:rPr>
-        <w:t>ผู้ช่วยศาสตราจารย์Apec</w:t>
-      </w:r>
-      <w:proofErr w:type="spellStart"/>
-      <w:r>
-        <w:rPr>
-          <w:rFonts w:ascii="TH Sarabun New" w:eastAsia="Times New Roman" w:hAnsi="TH Sarabun New" w:cs="TH Sarabun New"/>
-          <w:color w:val="000000" w:themeColor="text1"/>
-          <w:sz w:val="32"/>
-          <w:szCs w:val="32"/>
-          <w:lang w:eastAsia="en-GB"/>
+        <w:t xml:space="preserve">      (</w:t>
+      </w:r>
+      <w:r>
+        <w:rPr>
+          <w:rFonts w:ascii="TH Sarabun New" w:eastAsia="Times New Roman" w:hAnsi="TH Sarabun New" w:cs="TH Sarabun New"/>
+          <w:color w:val="000000" w:themeColor="text1"/>
+          <w:sz w:val="32"/>
+          <w:szCs w:val="32"/>
+          <w:lang w:eastAsia="en-GB"/>
+        </w:rPr>
+        <w:t>ผู้ช่วยศาสตราจารย์</w:t>
+      </w:r>
+      <w:r>
+        <w:rPr>
+          <w:rFonts w:ascii="TH Sarabun New" w:eastAsia="Times New Roman" w:hAnsi="TH Sarabun New" w:cs="TH Sarabun New"/>
+          <w:color w:val="000000" w:themeColor="text1"/>
+          <w:sz w:val="32"/>
+          <w:szCs w:val="32"/>
+          <w:lang w:val="en-US" w:eastAsia="en-GB"/>
         </w:rPr>
         <w:t/>
       </w:r>
-      <w:proofErr w:type="spellEnd"/>
       <w:r>
         <w:rPr>
           <w:rFonts w:ascii="TH Sarabun New" w:eastAsia="Times New Roman" w:hAnsi="TH Sarabun New" w:cs="TH Sarabun New"/>
@@ -1348,6 +1572,16 @@
           <w:lang w:eastAsia="en-GB"/>
         </w:rPr>
         <w:t/>
+      </w:r>
+      <w:r>
+        <w:rPr>
+          <w:rFonts w:ascii="TH Sarabun New" w:eastAsia="Times New Roman" w:hAnsi="TH Sarabun New" w:cs="TH Sarabun New"/>
+          <w:color w:val="000000" w:themeColor="text1"/>
+          <w:sz w:val="32"/>
+          <w:szCs w:val="32"/>
+          <w:lang w:eastAsia="en-GB"/>
+        </w:rPr>
+        <w:t>ทดสอบ ผู้ใช้งาน</w:t>
       </w:r>
       <w:r>
         <w:rPr>
@@ -1381,18 +1615,7 @@
           <w:cs/>
           <w:lang w:eastAsia="en-GB"/>
         </w:rPr>
-        <w:t xml:space="preserve">       </w:t>
-      </w:r>
-      <w:r>
-        <w:rPr>
-          <w:rFonts w:ascii="TH Sarabun New" w:eastAsia="Times New Roman" w:hAnsi="TH Sarabun New" w:cs="TH Sarabun New" w:hint="cs"/>
-          <w:color w:val="000000" w:themeColor="text1"/>
-          <w:sz w:val="32"/>
-          <w:szCs w:val="32"/>
-          <w:cs/>
-          <w:lang w:eastAsia="en-GB"/>
-        </w:rPr>
-        <w:t>ผู้ขอประเมินผลการสอน</w:t>
+        <w:t xml:space="preserve">       ผู้ขอประเมินผลการสอน</w:t>
       </w:r>
     </w:p>
     <w:p>
@@ -1439,40 +1662,12 @@
       <w:pPr>
         <w:spacing w:after="240"/>
         <w:ind w:left="283" w:right="283"/>
-        <w:jc w:val="center"/>
-        <w:rPr>
-          <w:rFonts w:ascii="TH Sarabun New" w:eastAsia="Times New Roman" w:hAnsi="TH Sarabun New" w:cs="TH Sarabun New"/>
-          <w:color w:val="000000" w:themeColor="text1"/>
-          <w:sz w:val="32"/>
-          <w:szCs w:val="32"/>
-          <w:lang w:eastAsia="en-GB"/>
-        </w:rPr>
-      </w:pPr>
-    </w:p>
-    <w:p>
-      <w:pPr>
-        <w:spacing w:after="240"/>
-        <w:ind w:left="283" w:right="283"/>
-        <w:jc w:val="center"/>
-        <w:rPr>
-          <w:rFonts w:ascii="TH Sarabun New" w:eastAsia="Times New Roman" w:hAnsi="TH Sarabun New" w:cs="TH Sarabun New"/>
-          <w:color w:val="000000" w:themeColor="text1"/>
-          <w:sz w:val="32"/>
-          <w:szCs w:val="32"/>
-          <w:lang w:eastAsia="en-GB"/>
-        </w:rPr>
-      </w:pPr>
-    </w:p>
-    <w:p>
-      <w:pPr>
-        <w:spacing w:after="240"/>
-        <w:ind w:left="283" w:right="283"/>
-        <w:rPr>
-          <w:rFonts w:ascii="TH Sarabun New" w:eastAsia="Times New Roman" w:hAnsi="TH Sarabun New" w:cs="TH Sarabun New"/>
-          <w:color w:val="000000" w:themeColor="text1"/>
-          <w:sz w:val="32"/>
-          <w:szCs w:val="32"/>
-          <w:lang w:val="en-US" w:eastAsia="en-GB"/>
+        <w:rPr>
+          <w:rFonts w:ascii="TH Sarabun New" w:eastAsia="Times New Roman" w:hAnsi="TH Sarabun New" w:cs="TH Sarabun New"/>
+          <w:color w:val="000000" w:themeColor="text1"/>
+          <w:sz w:val="32"/>
+          <w:szCs w:val="32"/>
+          <w:lang w:eastAsia="en-GB"/>
         </w:rPr>
       </w:pPr>
     </w:p>
@@ -2117,6 +2312,7 @@
   <w:style w:type="character" w:default="1" w:styleId="a0">
     <w:name w:val="Default Paragraph Font"/>
     <w:uiPriority w:val="1"/>
+    <w:semiHidden/>
     <w:unhideWhenUsed/>
   </w:style>
   <w:style w:type="table" w:default="1" w:styleId="a1">

</xml_diff>